<commit_message>
feat: enterprise MLOps model registry, Jupyter notebooks, FOCUS 1.0 warehouse and pagination
</commit_message>
<xml_diff>
--- a/Abhi_Cloud_Tech_FinOps_ML_Master_Documentation.docx
+++ b/Abhi_Cloud_Tech_FinOps_ML_Master_Documentation.docx
@@ -49,7 +49,17 @@
         <w:t xml:space="preserve">Infrastructure Scope: </w:t>
       </w:r>
       <w:r>
-        <w:t>AWS, Microsoft Azure, Google Cloud Platform (GCP)</w:t>
+        <w:t>AWS CUR 2.0, Microsoft Azure Cost Management, Google Cloud BigQuery Detailed Billing</w:t>
+        <w:br/>
+      </w:r>
+      <w:r>
+        <w:rPr>
+          <w:b/>
+        </w:rPr>
+        <w:t xml:space="preserve">Billing Standard &amp; Storage: </w:t>
+      </w:r>
+      <w:r>
+        <w:t>FinOps Open Cost &amp; Usage Specification (FOCUS™ 1.0) | High-Performance Indexed SQLite Warehouse</w:t>
         <w:br/>
       </w:r>
       <w:r>
@@ -69,7 +79,7 @@
         <w:t xml:space="preserve">Evaluation Benchmarks: </w:t>
       </w:r>
       <w:r>
-        <w:t>MAPE: 4.87% | RMSE: $1,573 | Annual Cost Waste Recovery: $2,752,739 (32.9%)</w:t>
+        <w:t>MAPE: 2.48% | RMSE: $671.79 | Anomaly F1: 0.9707 | Annual Waste Recovery: $2,123,828 (31.9%)</w:t>
       </w:r>
     </w:p>
     <w:p>
@@ -87,12 +97,12 @@
     </w:p>
     <w:p>
       <w:r>
-        <w:t>Abhi Cloud Tech is an enterprise running 100% of its microservices, AI/ML research pipelines, and data streaming clusters across Amazon Web Services (AWS), Microsoft Azure, and Google Cloud Platform (GCP). As workload demand scaled, the organization faced an annualized cloud run-rate exceeding $8.34 Million USD. More critically, decentralized procurement and asynchronous auto-scaling led to an estimated 32.9% in cloud waste—specifically from unmonitored zombie GPU clusters, runaway internet egress, and orphan storage volumes.</w:t>
+        <w:t>Abhi Cloud Tech is an enterprise operating 100% of its microservices, AI/ML research pipelines, and data streaming clusters simultaneously across Amazon Web Services (AWS), Microsoft Azure, and Google Cloud Platform (GCP). While each individual cloud provider provides native billing portals, modern multi-cloud enterprises suffer from vendor lock-in, siloed dashboards, and fragmented billing schemas. AWS produces Cost &amp; Usage Reports (CUR 2.0), GCP streams BigQuery Detailed Billing, and Azure exports Cost Management data—each with conflicting column nomenclatures, rate representations, and tagging constructs.</w:t>
       </w:r>
     </w:p>
     <w:p>
       <w:r>
-        <w:t>To solve this, Abhi Cloud Tech engineered an autonomous Machine Learning FinOps Control Plane. The system standardizes multi-cloud telemetry, deploys dual-layer unsupervised anomaly detection within 24 hours, generates probabilistic 30/60/90-day spend forecasts using Quantile Gradient Boosting (achieving 4.87% MAPE), and prescribes automated engineering rightsizing actions.</w:t>
+        <w:t>To solve this fragmentation, Abhi Cloud Tech engineered an autonomous Machine Learning FinOps Control Plane. The system standardizes multi-cloud telemetry under the official FinOps Open Cost &amp; Usage Specification (FOCUS™ 1.0) standard, indexes records inside an embedded SQLite high-throughput warehouse (`finops_warehouse.db`), deploys dual-layer unsupervised anomaly detection within 24 hours, generates probabilistic 30/60/90-day spend forecasts using Quantile Gradient Boosting (achieving 4.98% MAPE), and prescribes automated engineering rightsizing actions recovering $2.12M in annual cloud waste.</w:t>
       </w:r>
     </w:p>
     <w:p>
@@ -100,12 +110,12 @@
         <w:pStyle w:val="Heading1"/>
       </w:pPr>
       <w:r>
-        <w:t>2. Multi-Cloud Telemetry Dataset &amp; Feature Architecture</w:t>
+        <w:t>2. FinOps FOCUS™ 1.0 Specification &amp; Real-Time Multi-Cloud Billing Architecture</w:t>
       </w:r>
     </w:p>
     <w:p>
       <w:r>
-        <w:t>The system ingests 27,375 records spanning 365 days of continuous operations. Every record captures resource consumption and billing for 3 cloud providers across 5 corporate divisions.</w:t>
+        <w:t>The system ingests 27,375 normalized records spanning 365 days of continuous operations. Instead of generic synthetic columns, the warehouse ingests authentic multi-cloud attributes from AWS CUR 2.0, Azure Cost Management, and GCP BigQuery Detailed Billing, seamlessly mapped into FOCUS 1.0 dimensions:</w:t>
       </w:r>
     </w:p>
     <w:tbl>
@@ -133,7 +143,7 @@
                 <w:color w:val="FFFFFF"/>
                 <w:sz w:val="19"/>
               </w:rPr>
-              <w:t>Column Name</w:t>
+              <w:t>FOCUS™ 1.0 Dimension</w:t>
             </w:r>
           </w:p>
         </w:tc>
@@ -149,7 +159,7 @@
                 <w:color w:val="FFFFFF"/>
                 <w:sz w:val="19"/>
               </w:rPr>
-              <w:t>Data Type</w:t>
+              <w:t>AWS CUR 2.0 Mapping</w:t>
             </w:r>
           </w:p>
         </w:tc>
@@ -165,7 +175,7 @@
                 <w:color w:val="FFFFFF"/>
                 <w:sz w:val="19"/>
               </w:rPr>
-              <w:t>Source / Calculation</w:t>
+              <w:t>Azure Cost Management</w:t>
             </w:r>
           </w:p>
         </w:tc>
@@ -181,7 +191,7 @@
                 <w:color w:val="FFFFFF"/>
                 <w:sz w:val="19"/>
               </w:rPr>
-              <w:t>Business &amp; ML Purpose</w:t>
+              <w:t>GCP BigQuery Detailed Billing</w:t>
             </w:r>
           </w:p>
         </w:tc>
@@ -191,18 +201,18 @@
           <w:tcPr>
             <w:tcW w:type="dxa" w:w="2340"/>
             <w:tcMar>
-              <w:top w:w="60" w:type="dxa"/>
-              <w:bottom w:w="60" w:type="dxa"/>
-              <w:left w:w="100" w:type="dxa"/>
-              <w:right w:w="100" w:type="dxa"/>
+              <w:top w:w="50" w:type="dxa"/>
+              <w:bottom w:w="50" w:type="dxa"/>
+              <w:left w:w="80" w:type="dxa"/>
+              <w:right w:w="80" w:type="dxa"/>
             </w:tcMar>
           </w:tcPr>
           <w:p>
             <w:r>
               <w:rPr>
-                <w:sz w:val="18"/>
+                <w:sz w:val="17"/>
               </w:rPr>
-              <w:t>Date</w:t>
+              <w:t>ChargePeriodStart</w:t>
             </w:r>
           </w:p>
         </w:tc>
@@ -210,18 +220,18 @@
           <w:tcPr>
             <w:tcW w:type="dxa" w:w="2340"/>
             <w:tcMar>
-              <w:top w:w="60" w:type="dxa"/>
-              <w:bottom w:w="60" w:type="dxa"/>
-              <w:left w:w="100" w:type="dxa"/>
-              <w:right w:w="100" w:type="dxa"/>
+              <w:top w:w="50" w:type="dxa"/>
+              <w:bottom w:w="50" w:type="dxa"/>
+              <w:left w:w="80" w:type="dxa"/>
+              <w:right w:w="80" w:type="dxa"/>
             </w:tcMar>
           </w:tcPr>
           <w:p>
             <w:r>
               <w:rPr>
-                <w:sz w:val="18"/>
+                <w:sz w:val="17"/>
               </w:rPr>
-              <w:t>string (YYYY-MM-DD)</w:t>
+              <w:t>lineItem/UsageStartDate</w:t>
             </w:r>
           </w:p>
         </w:tc>
@@ -229,18 +239,18 @@
           <w:tcPr>
             <w:tcW w:type="dxa" w:w="2340"/>
             <w:tcMar>
-              <w:top w:w="60" w:type="dxa"/>
-              <w:bottom w:w="60" w:type="dxa"/>
-              <w:left w:w="100" w:type="dxa"/>
-              <w:right w:w="100" w:type="dxa"/>
+              <w:top w:w="50" w:type="dxa"/>
+              <w:bottom w:w="50" w:type="dxa"/>
+              <w:left w:w="80" w:type="dxa"/>
+              <w:right w:w="80" w:type="dxa"/>
             </w:tcMar>
           </w:tcPr>
           <w:p>
             <w:r>
               <w:rPr>
-                <w:sz w:val="18"/>
+                <w:sz w:val="17"/>
               </w:rPr>
-              <w:t>Time index (365 days)</w:t>
+              <w:t>BillingPeriodStartDate</w:t>
             </w:r>
           </w:p>
         </w:tc>
@@ -248,18 +258,18 @@
           <w:tcPr>
             <w:tcW w:type="dxa" w:w="2340"/>
             <w:tcMar>
-              <w:top w:w="60" w:type="dxa"/>
-              <w:bottom w:w="60" w:type="dxa"/>
-              <w:left w:w="100" w:type="dxa"/>
-              <w:right w:w="100" w:type="dxa"/>
+              <w:top w:w="50" w:type="dxa"/>
+              <w:bottom w:w="50" w:type="dxa"/>
+              <w:left w:w="80" w:type="dxa"/>
+              <w:right w:w="80" w:type="dxa"/>
             </w:tcMar>
           </w:tcPr>
           <w:p>
             <w:r>
               <w:rPr>
-                <w:sz w:val="18"/>
+                <w:sz w:val="17"/>
               </w:rPr>
-              <w:t>Temporal ordering for moving averages &amp; lags</w:t>
+              <w:t>usage_start_time</w:t>
             </w:r>
           </w:p>
         </w:tc>
@@ -269,18 +279,18 @@
           <w:tcPr>
             <w:tcW w:type="dxa" w:w="2340"/>
             <w:tcMar>
-              <w:top w:w="60" w:type="dxa"/>
-              <w:bottom w:w="60" w:type="dxa"/>
-              <w:left w:w="100" w:type="dxa"/>
-              <w:right w:w="100" w:type="dxa"/>
+              <w:top w:w="50" w:type="dxa"/>
+              <w:bottom w:w="50" w:type="dxa"/>
+              <w:left w:w="80" w:type="dxa"/>
+              <w:right w:w="80" w:type="dxa"/>
             </w:tcMar>
           </w:tcPr>
           <w:p>
             <w:r>
               <w:rPr>
-                <w:sz w:val="18"/>
+                <w:sz w:val="17"/>
               </w:rPr>
-              <w:t>CloudProvider</w:t>
+              <w:t>ProviderName</w:t>
             </w:r>
           </w:p>
         </w:tc>
@@ -288,18 +298,18 @@
           <w:tcPr>
             <w:tcW w:type="dxa" w:w="2340"/>
             <w:tcMar>
-              <w:top w:w="60" w:type="dxa"/>
-              <w:bottom w:w="60" w:type="dxa"/>
-              <w:left w:w="100" w:type="dxa"/>
-              <w:right w:w="100" w:type="dxa"/>
+              <w:top w:w="50" w:type="dxa"/>
+              <w:bottom w:w="50" w:type="dxa"/>
+              <w:left w:w="80" w:type="dxa"/>
+              <w:right w:w="80" w:type="dxa"/>
             </w:tcMar>
           </w:tcPr>
           <w:p>
             <w:r>
               <w:rPr>
-                <w:sz w:val="18"/>
+                <w:sz w:val="17"/>
               </w:rPr>
-              <w:t>categorical</w:t>
+              <w:t>'AWS'</w:t>
             </w:r>
           </w:p>
         </w:tc>
@@ -307,18 +317,18 @@
           <w:tcPr>
             <w:tcW w:type="dxa" w:w="2340"/>
             <w:tcMar>
-              <w:top w:w="60" w:type="dxa"/>
-              <w:bottom w:w="60" w:type="dxa"/>
-              <w:left w:w="100" w:type="dxa"/>
-              <w:right w:w="100" w:type="dxa"/>
+              <w:top w:w="50" w:type="dxa"/>
+              <w:bottom w:w="50" w:type="dxa"/>
+              <w:left w:w="80" w:type="dxa"/>
+              <w:right w:w="80" w:type="dxa"/>
             </w:tcMar>
           </w:tcPr>
           <w:p>
             <w:r>
               <w:rPr>
-                <w:sz w:val="18"/>
+                <w:sz w:val="17"/>
               </w:rPr>
-              <w:t>AWS, Azure, GCP</w:t>
+              <w:t>'Azure'</w:t>
             </w:r>
           </w:p>
         </w:tc>
@@ -326,18 +336,18 @@
           <w:tcPr>
             <w:tcW w:type="dxa" w:w="2340"/>
             <w:tcMar>
-              <w:top w:w="60" w:type="dxa"/>
-              <w:bottom w:w="60" w:type="dxa"/>
-              <w:left w:w="100" w:type="dxa"/>
-              <w:right w:w="100" w:type="dxa"/>
+              <w:top w:w="50" w:type="dxa"/>
+              <w:bottom w:w="50" w:type="dxa"/>
+              <w:left w:w="80" w:type="dxa"/>
+              <w:right w:w="80" w:type="dxa"/>
             </w:tcMar>
           </w:tcPr>
           <w:p>
             <w:r>
               <w:rPr>
-                <w:sz w:val="18"/>
+                <w:sz w:val="17"/>
               </w:rPr>
-              <w:t>Vendor attribution and multi-cloud split</w:t>
+              <w:t>'Google Cloud'</w:t>
             </w:r>
           </w:p>
         </w:tc>
@@ -347,18 +357,18 @@
           <w:tcPr>
             <w:tcW w:type="dxa" w:w="2340"/>
             <w:tcMar>
-              <w:top w:w="60" w:type="dxa"/>
-              <w:bottom w:w="60" w:type="dxa"/>
-              <w:left w:w="100" w:type="dxa"/>
-              <w:right w:w="100" w:type="dxa"/>
+              <w:top w:w="50" w:type="dxa"/>
+              <w:bottom w:w="50" w:type="dxa"/>
+              <w:left w:w="80" w:type="dxa"/>
+              <w:right w:w="80" w:type="dxa"/>
             </w:tcMar>
           </w:tcPr>
           <w:p>
             <w:r>
               <w:rPr>
-                <w:sz w:val="18"/>
+                <w:sz w:val="17"/>
               </w:rPr>
-              <w:t>Department</w:t>
+              <w:t>BillingAccountId</w:t>
             </w:r>
           </w:p>
         </w:tc>
@@ -366,18 +376,18 @@
           <w:tcPr>
             <w:tcW w:type="dxa" w:w="2340"/>
             <w:tcMar>
-              <w:top w:w="60" w:type="dxa"/>
-              <w:bottom w:w="60" w:type="dxa"/>
-              <w:left w:w="100" w:type="dxa"/>
-              <w:right w:w="100" w:type="dxa"/>
+              <w:top w:w="50" w:type="dxa"/>
+              <w:bottom w:w="50" w:type="dxa"/>
+              <w:left w:w="80" w:type="dxa"/>
+              <w:right w:w="80" w:type="dxa"/>
             </w:tcMar>
           </w:tcPr>
           <w:p>
             <w:r>
               <w:rPr>
-                <w:sz w:val="18"/>
+                <w:sz w:val="17"/>
               </w:rPr>
-              <w:t>categorical</w:t>
+              <w:t>bill/BillingAccountId</w:t>
             </w:r>
           </w:p>
         </w:tc>
@@ -385,18 +395,18 @@
           <w:tcPr>
             <w:tcW w:type="dxa" w:w="2340"/>
             <w:tcMar>
-              <w:top w:w="60" w:type="dxa"/>
-              <w:bottom w:w="60" w:type="dxa"/>
-              <w:left w:w="100" w:type="dxa"/>
-              <w:right w:w="100" w:type="dxa"/>
+              <w:top w:w="50" w:type="dxa"/>
+              <w:bottom w:w="50" w:type="dxa"/>
+              <w:left w:w="80" w:type="dxa"/>
+              <w:right w:w="80" w:type="dxa"/>
             </w:tcMar>
           </w:tcPr>
           <w:p>
             <w:r>
               <w:rPr>
-                <w:sz w:val="18"/>
+                <w:sz w:val="17"/>
               </w:rPr>
-              <w:t>5 Cost Centers</w:t>
+              <w:t>BillingAccountId</w:t>
             </w:r>
           </w:p>
         </w:tc>
@@ -404,18 +414,18 @@
           <w:tcPr>
             <w:tcW w:type="dxa" w:w="2340"/>
             <w:tcMar>
-              <w:top w:w="60" w:type="dxa"/>
-              <w:bottom w:w="60" w:type="dxa"/>
-              <w:left w:w="100" w:type="dxa"/>
-              <w:right w:w="100" w:type="dxa"/>
+              <w:top w:w="50" w:type="dxa"/>
+              <w:bottom w:w="50" w:type="dxa"/>
+              <w:left w:w="80" w:type="dxa"/>
+              <w:right w:w="80" w:type="dxa"/>
             </w:tcMar>
           </w:tcPr>
           <w:p>
             <w:r>
               <w:rPr>
-                <w:sz w:val="18"/>
+                <w:sz w:val="17"/>
               </w:rPr>
-              <w:t>Unit economics and departmental accountability</w:t>
+              <w:t>billing_account_id</w:t>
             </w:r>
           </w:p>
         </w:tc>
@@ -425,18 +435,18 @@
           <w:tcPr>
             <w:tcW w:type="dxa" w:w="2340"/>
             <w:tcMar>
-              <w:top w:w="60" w:type="dxa"/>
-              <w:bottom w:w="60" w:type="dxa"/>
-              <w:left w:w="100" w:type="dxa"/>
-              <w:right w:w="100" w:type="dxa"/>
+              <w:top w:w="50" w:type="dxa"/>
+              <w:bottom w:w="50" w:type="dxa"/>
+              <w:left w:w="80" w:type="dxa"/>
+              <w:right w:w="80" w:type="dxa"/>
             </w:tcMar>
           </w:tcPr>
           <w:p>
             <w:r>
               <w:rPr>
-                <w:sz w:val="18"/>
+                <w:sz w:val="17"/>
               </w:rPr>
-              <w:t>Service</w:t>
+              <w:t>SubAccountId</w:t>
             </w:r>
           </w:p>
         </w:tc>
@@ -444,18 +454,18 @@
           <w:tcPr>
             <w:tcW w:type="dxa" w:w="2340"/>
             <w:tcMar>
-              <w:top w:w="60" w:type="dxa"/>
-              <w:bottom w:w="60" w:type="dxa"/>
-              <w:left w:w="100" w:type="dxa"/>
-              <w:right w:w="100" w:type="dxa"/>
+              <w:top w:w="50" w:type="dxa"/>
+              <w:bottom w:w="50" w:type="dxa"/>
+              <w:left w:w="80" w:type="dxa"/>
+              <w:right w:w="80" w:type="dxa"/>
             </w:tcMar>
           </w:tcPr>
           <w:p>
             <w:r>
               <w:rPr>
-                <w:sz w:val="18"/>
+                <w:sz w:val="17"/>
               </w:rPr>
-              <w:t>string</w:t>
+              <w:t>lineItem/UsageAccountId</w:t>
             </w:r>
           </w:p>
         </w:tc>
@@ -463,18 +473,18 @@
           <w:tcPr>
             <w:tcW w:type="dxa" w:w="2340"/>
             <w:tcMar>
-              <w:top w:w="60" w:type="dxa"/>
-              <w:bottom w:w="60" w:type="dxa"/>
-              <w:left w:w="100" w:type="dxa"/>
-              <w:right w:w="100" w:type="dxa"/>
+              <w:top w:w="50" w:type="dxa"/>
+              <w:bottom w:w="50" w:type="dxa"/>
+              <w:left w:w="80" w:type="dxa"/>
+              <w:right w:w="80" w:type="dxa"/>
             </w:tcMar>
           </w:tcPr>
           <w:p>
             <w:r>
               <w:rPr>
-                <w:sz w:val="18"/>
+                <w:sz w:val="17"/>
               </w:rPr>
-              <w:t>Compute, Storage, DB, Egress, etc.</w:t>
+              <w:t>SubscriptionId</w:t>
             </w:r>
           </w:p>
         </w:tc>
@@ -482,18 +492,18 @@
           <w:tcPr>
             <w:tcW w:type="dxa" w:w="2340"/>
             <w:tcMar>
-              <w:top w:w="60" w:type="dxa"/>
-              <w:bottom w:w="60" w:type="dxa"/>
-              <w:left w:w="100" w:type="dxa"/>
-              <w:right w:w="100" w:type="dxa"/>
+              <w:top w:w="50" w:type="dxa"/>
+              <w:bottom w:w="50" w:type="dxa"/>
+              <w:left w:w="80" w:type="dxa"/>
+              <w:right w:w="80" w:type="dxa"/>
             </w:tcMar>
           </w:tcPr>
           <w:p>
             <w:r>
               <w:rPr>
-                <w:sz w:val="18"/>
+                <w:sz w:val="17"/>
               </w:rPr>
-              <w:t>Granular resource tracking</w:t>
+              <w:t>project.id</w:t>
             </w:r>
           </w:p>
         </w:tc>
@@ -503,18 +513,18 @@
           <w:tcPr>
             <w:tcW w:type="dxa" w:w="2340"/>
             <w:tcMar>
-              <w:top w:w="60" w:type="dxa"/>
-              <w:bottom w:w="60" w:type="dxa"/>
-              <w:left w:w="100" w:type="dxa"/>
-              <w:right w:w="100" w:type="dxa"/>
+              <w:top w:w="50" w:type="dxa"/>
+              <w:bottom w:w="50" w:type="dxa"/>
+              <w:left w:w="80" w:type="dxa"/>
+              <w:right w:w="80" w:type="dxa"/>
             </w:tcMar>
           </w:tcPr>
           <w:p>
             <w:r>
               <w:rPr>
-                <w:sz w:val="18"/>
+                <w:sz w:val="17"/>
               </w:rPr>
-              <w:t>DailyCost_USD</w:t>
+              <w:t>RegionId</w:t>
             </w:r>
           </w:p>
         </w:tc>
@@ -522,18 +532,18 @@
           <w:tcPr>
             <w:tcW w:type="dxa" w:w="2340"/>
             <w:tcMar>
-              <w:top w:w="60" w:type="dxa"/>
-              <w:bottom w:w="60" w:type="dxa"/>
-              <w:left w:w="100" w:type="dxa"/>
-              <w:right w:w="100" w:type="dxa"/>
+              <w:top w:w="50" w:type="dxa"/>
+              <w:bottom w:w="50" w:type="dxa"/>
+              <w:left w:w="80" w:type="dxa"/>
+              <w:right w:w="80" w:type="dxa"/>
             </w:tcMar>
           </w:tcPr>
           <w:p>
             <w:r>
               <w:rPr>
-                <w:sz w:val="18"/>
+                <w:sz w:val="17"/>
               </w:rPr>
-              <w:t>float</w:t>
+              <w:t>product/region</w:t>
             </w:r>
           </w:p>
         </w:tc>
@@ -541,18 +551,18 @@
           <w:tcPr>
             <w:tcW w:type="dxa" w:w="2340"/>
             <w:tcMar>
-              <w:top w:w="60" w:type="dxa"/>
-              <w:bottom w:w="60" w:type="dxa"/>
-              <w:left w:w="100" w:type="dxa"/>
-              <w:right w:w="100" w:type="dxa"/>
+              <w:top w:w="50" w:type="dxa"/>
+              <w:bottom w:w="50" w:type="dxa"/>
+              <w:left w:w="80" w:type="dxa"/>
+              <w:right w:w="80" w:type="dxa"/>
             </w:tcMar>
           </w:tcPr>
           <w:p>
             <w:r>
               <w:rPr>
-                <w:sz w:val="18"/>
+                <w:sz w:val="17"/>
               </w:rPr>
-              <w:t>Hourly rate * active hours</w:t>
+              <w:t>ResourceLocation</w:t>
             </w:r>
           </w:p>
         </w:tc>
@@ -560,18 +570,18 @@
           <w:tcPr>
             <w:tcW w:type="dxa" w:w="2340"/>
             <w:tcMar>
-              <w:top w:w="60" w:type="dxa"/>
-              <w:bottom w:w="60" w:type="dxa"/>
-              <w:left w:w="100" w:type="dxa"/>
-              <w:right w:w="100" w:type="dxa"/>
+              <w:top w:w="50" w:type="dxa"/>
+              <w:bottom w:w="50" w:type="dxa"/>
+              <w:left w:w="80" w:type="dxa"/>
+              <w:right w:w="80" w:type="dxa"/>
             </w:tcMar>
           </w:tcPr>
           <w:p>
             <w:r>
               <w:rPr>
-                <w:sz w:val="18"/>
+                <w:sz w:val="17"/>
               </w:rPr>
-              <w:t>Primary financial target variable</w:t>
+              <w:t>location.region</w:t>
             </w:r>
           </w:p>
         </w:tc>
@@ -581,18 +591,18 @@
           <w:tcPr>
             <w:tcW w:type="dxa" w:w="2340"/>
             <w:tcMar>
-              <w:top w:w="60" w:type="dxa"/>
-              <w:bottom w:w="60" w:type="dxa"/>
-              <w:left w:w="100" w:type="dxa"/>
-              <w:right w:w="100" w:type="dxa"/>
+              <w:top w:w="50" w:type="dxa"/>
+              <w:bottom w:w="50" w:type="dxa"/>
+              <w:left w:w="80" w:type="dxa"/>
+              <w:right w:w="80" w:type="dxa"/>
             </w:tcMar>
           </w:tcPr>
           <w:p>
             <w:r>
               <w:rPr>
-                <w:sz w:val="18"/>
+                <w:sz w:val="17"/>
               </w:rPr>
-              <w:t>vCPU_Hours</w:t>
+              <w:t>RegionName</w:t>
             </w:r>
           </w:p>
         </w:tc>
@@ -600,18 +610,18 @@
           <w:tcPr>
             <w:tcW w:type="dxa" w:w="2340"/>
             <w:tcMar>
-              <w:top w:w="60" w:type="dxa"/>
-              <w:bottom w:w="60" w:type="dxa"/>
-              <w:left w:w="100" w:type="dxa"/>
-              <w:right w:w="100" w:type="dxa"/>
+              <w:top w:w="50" w:type="dxa"/>
+              <w:bottom w:w="50" w:type="dxa"/>
+              <w:left w:w="80" w:type="dxa"/>
+              <w:right w:w="80" w:type="dxa"/>
             </w:tcMar>
           </w:tcPr>
           <w:p>
             <w:r>
               <w:rPr>
-                <w:sz w:val="18"/>
+                <w:sz w:val="17"/>
               </w:rPr>
-              <w:t>integer</w:t>
+              <w:t>product/regionCodeDescription</w:t>
             </w:r>
           </w:p>
         </w:tc>
@@ -619,18 +629,18 @@
           <w:tcPr>
             <w:tcW w:type="dxa" w:w="2340"/>
             <w:tcMar>
-              <w:top w:w="60" w:type="dxa"/>
-              <w:bottom w:w="60" w:type="dxa"/>
-              <w:left w:w="100" w:type="dxa"/>
-              <w:right w:w="100" w:type="dxa"/>
+              <w:top w:w="50" w:type="dxa"/>
+              <w:bottom w:w="50" w:type="dxa"/>
+              <w:left w:w="80" w:type="dxa"/>
+              <w:right w:w="80" w:type="dxa"/>
             </w:tcMar>
           </w:tcPr>
           <w:p>
             <w:r>
               <w:rPr>
-                <w:sz w:val="18"/>
+                <w:sz w:val="17"/>
               </w:rPr>
-              <w:t>Allocated cores * runtime</w:t>
+              <w:t>ResourceLocationName</w:t>
             </w:r>
           </w:p>
         </w:tc>
@@ -638,18 +648,18 @@
           <w:tcPr>
             <w:tcW w:type="dxa" w:w="2340"/>
             <w:tcMar>
-              <w:top w:w="60" w:type="dxa"/>
-              <w:bottom w:w="60" w:type="dxa"/>
-              <w:left w:w="100" w:type="dxa"/>
-              <w:right w:w="100" w:type="dxa"/>
+              <w:top w:w="50" w:type="dxa"/>
+              <w:bottom w:w="50" w:type="dxa"/>
+              <w:left w:w="80" w:type="dxa"/>
+              <w:right w:w="80" w:type="dxa"/>
             </w:tcMar>
           </w:tcPr>
           <w:p>
             <w:r>
               <w:rPr>
-                <w:sz w:val="18"/>
+                <w:sz w:val="17"/>
               </w:rPr>
-              <w:t>Compute capacity telemetry feature</w:t>
+              <w:t>location.zone</w:t>
             </w:r>
           </w:p>
         </w:tc>
@@ -659,18 +669,18 @@
           <w:tcPr>
             <w:tcW w:type="dxa" w:w="2340"/>
             <w:tcMar>
-              <w:top w:w="60" w:type="dxa"/>
-              <w:bottom w:w="60" w:type="dxa"/>
-              <w:left w:w="100" w:type="dxa"/>
-              <w:right w:w="100" w:type="dxa"/>
+              <w:top w:w="50" w:type="dxa"/>
+              <w:bottom w:w="50" w:type="dxa"/>
+              <w:left w:w="80" w:type="dxa"/>
+              <w:right w:w="80" w:type="dxa"/>
             </w:tcMar>
           </w:tcPr>
           <w:p>
             <w:r>
               <w:rPr>
-                <w:sz w:val="18"/>
+                <w:sz w:val="17"/>
               </w:rPr>
-              <w:t>Memory_GB_Hours</w:t>
+              <w:t>ServiceName</w:t>
             </w:r>
           </w:p>
         </w:tc>
@@ -678,18 +688,18 @@
           <w:tcPr>
             <w:tcW w:type="dxa" w:w="2340"/>
             <w:tcMar>
-              <w:top w:w="60" w:type="dxa"/>
-              <w:bottom w:w="60" w:type="dxa"/>
-              <w:left w:w="100" w:type="dxa"/>
-              <w:right w:w="100" w:type="dxa"/>
+              <w:top w:w="50" w:type="dxa"/>
+              <w:bottom w:w="50" w:type="dxa"/>
+              <w:left w:w="80" w:type="dxa"/>
+              <w:right w:w="80" w:type="dxa"/>
             </w:tcMar>
           </w:tcPr>
           <w:p>
             <w:r>
               <w:rPr>
-                <w:sz w:val="18"/>
+                <w:sz w:val="17"/>
               </w:rPr>
-              <w:t>integer</w:t>
+              <w:t>lineItem/ProductCode</w:t>
             </w:r>
           </w:p>
         </w:tc>
@@ -697,18 +707,18 @@
           <w:tcPr>
             <w:tcW w:type="dxa" w:w="2340"/>
             <w:tcMar>
-              <w:top w:w="60" w:type="dxa"/>
-              <w:bottom w:w="60" w:type="dxa"/>
-              <w:left w:w="100" w:type="dxa"/>
-              <w:right w:w="100" w:type="dxa"/>
+              <w:top w:w="50" w:type="dxa"/>
+              <w:bottom w:w="50" w:type="dxa"/>
+              <w:left w:w="80" w:type="dxa"/>
+              <w:right w:w="80" w:type="dxa"/>
             </w:tcMar>
           </w:tcPr>
           <w:p>
             <w:r>
               <w:rPr>
-                <w:sz w:val="18"/>
+                <w:sz w:val="17"/>
               </w:rPr>
-              <w:t>RAM GB * runtime</w:t>
+              <w:t>ConsumedService</w:t>
             </w:r>
           </w:p>
         </w:tc>
@@ -716,18 +726,18 @@
           <w:tcPr>
             <w:tcW w:type="dxa" w:w="2340"/>
             <w:tcMar>
-              <w:top w:w="60" w:type="dxa"/>
-              <w:bottom w:w="60" w:type="dxa"/>
-              <w:left w:w="100" w:type="dxa"/>
-              <w:right w:w="100" w:type="dxa"/>
+              <w:top w:w="50" w:type="dxa"/>
+              <w:bottom w:w="50" w:type="dxa"/>
+              <w:left w:w="80" w:type="dxa"/>
+              <w:right w:w="80" w:type="dxa"/>
             </w:tcMar>
           </w:tcPr>
           <w:p>
             <w:r>
               <w:rPr>
-                <w:sz w:val="18"/>
+                <w:sz w:val="17"/>
               </w:rPr>
-              <w:t>Memory footprint telemetry feature</w:t>
+              <w:t>service.description</w:t>
             </w:r>
           </w:p>
         </w:tc>
@@ -737,18 +747,18 @@
           <w:tcPr>
             <w:tcW w:type="dxa" w:w="2340"/>
             <w:tcMar>
-              <w:top w:w="60" w:type="dxa"/>
-              <w:bottom w:w="60" w:type="dxa"/>
-              <w:left w:w="100" w:type="dxa"/>
-              <w:right w:w="100" w:type="dxa"/>
+              <w:top w:w="50" w:type="dxa"/>
+              <w:bottom w:w="50" w:type="dxa"/>
+              <w:left w:w="80" w:type="dxa"/>
+              <w:right w:w="80" w:type="dxa"/>
             </w:tcMar>
           </w:tcPr>
           <w:p>
             <w:r>
               <w:rPr>
-                <w:sz w:val="18"/>
+                <w:sz w:val="17"/>
               </w:rPr>
-              <w:t>Avg_CPU_Utilization_Pct</w:t>
+              <w:t>ServiceCategory</w:t>
             </w:r>
           </w:p>
         </w:tc>
@@ -756,18 +766,18 @@
           <w:tcPr>
             <w:tcW w:type="dxa" w:w="2340"/>
             <w:tcMar>
-              <w:top w:w="60" w:type="dxa"/>
-              <w:bottom w:w="60" w:type="dxa"/>
-              <w:left w:w="100" w:type="dxa"/>
-              <w:right w:w="100" w:type="dxa"/>
+              <w:top w:w="50" w:type="dxa"/>
+              <w:bottom w:w="50" w:type="dxa"/>
+              <w:left w:w="80" w:type="dxa"/>
+              <w:right w:w="80" w:type="dxa"/>
             </w:tcMar>
           </w:tcPr>
           <w:p>
             <w:r>
               <w:rPr>
-                <w:sz w:val="18"/>
+                <w:sz w:val="17"/>
               </w:rPr>
-              <w:t>float</w:t>
+              <w:t>product/serviceCategory</w:t>
             </w:r>
           </w:p>
         </w:tc>
@@ -775,18 +785,18 @@
           <w:tcPr>
             <w:tcW w:type="dxa" w:w="2340"/>
             <w:tcMar>
-              <w:top w:w="60" w:type="dxa"/>
-              <w:bottom w:w="60" w:type="dxa"/>
-              <w:left w:w="100" w:type="dxa"/>
-              <w:right w:w="100" w:type="dxa"/>
+              <w:top w:w="50" w:type="dxa"/>
+              <w:bottom w:w="50" w:type="dxa"/>
+              <w:left w:w="80" w:type="dxa"/>
+              <w:right w:w="80" w:type="dxa"/>
             </w:tcMar>
           </w:tcPr>
           <w:p>
             <w:r>
               <w:rPr>
-                <w:sz w:val="18"/>
+                <w:sz w:val="17"/>
               </w:rPr>
-              <w:t>Telemetry average (0-100%)</w:t>
+              <w:t>MeterCategory</w:t>
             </w:r>
           </w:p>
         </w:tc>
@@ -794,18 +804,18 @@
           <w:tcPr>
             <w:tcW w:type="dxa" w:w="2340"/>
             <w:tcMar>
-              <w:top w:w="60" w:type="dxa"/>
-              <w:bottom w:w="60" w:type="dxa"/>
-              <w:left w:w="100" w:type="dxa"/>
-              <w:right w:w="100" w:type="dxa"/>
+              <w:top w:w="50" w:type="dxa"/>
+              <w:bottom w:w="50" w:type="dxa"/>
+              <w:left w:w="80" w:type="dxa"/>
+              <w:right w:w="80" w:type="dxa"/>
             </w:tcMar>
           </w:tcPr>
           <w:p>
             <w:r>
               <w:rPr>
-                <w:sz w:val="18"/>
+                <w:sz w:val="17"/>
               </w:rPr>
-              <w:t>Key efficiency metric for zombie detection</w:t>
+              <w:t>service.category</w:t>
             </w:r>
           </w:p>
         </w:tc>
@@ -815,18 +825,18 @@
           <w:tcPr>
             <w:tcW w:type="dxa" w:w="2340"/>
             <w:tcMar>
-              <w:top w:w="60" w:type="dxa"/>
-              <w:bottom w:w="60" w:type="dxa"/>
-              <w:left w:w="100" w:type="dxa"/>
-              <w:right w:w="100" w:type="dxa"/>
+              <w:top w:w="50" w:type="dxa"/>
+              <w:bottom w:w="50" w:type="dxa"/>
+              <w:left w:w="80" w:type="dxa"/>
+              <w:right w:w="80" w:type="dxa"/>
             </w:tcMar>
           </w:tcPr>
           <w:p>
             <w:r>
               <w:rPr>
-                <w:sz w:val="18"/>
+                <w:sz w:val="17"/>
               </w:rPr>
-              <w:t>Storage_TB</w:t>
+              <w:t>ResourceId</w:t>
             </w:r>
           </w:p>
         </w:tc>
@@ -834,18 +844,18 @@
           <w:tcPr>
             <w:tcW w:type="dxa" w:w="2340"/>
             <w:tcMar>
-              <w:top w:w="60" w:type="dxa"/>
-              <w:bottom w:w="60" w:type="dxa"/>
-              <w:left w:w="100" w:type="dxa"/>
-              <w:right w:w="100" w:type="dxa"/>
+              <w:top w:w="50" w:type="dxa"/>
+              <w:bottom w:w="50" w:type="dxa"/>
+              <w:left w:w="80" w:type="dxa"/>
+              <w:right w:w="80" w:type="dxa"/>
             </w:tcMar>
           </w:tcPr>
           <w:p>
             <w:r>
               <w:rPr>
-                <w:sz w:val="18"/>
+                <w:sz w:val="17"/>
               </w:rPr>
-              <w:t>float</w:t>
+              <w:t>lineItem/ResourceId (ARN)</w:t>
             </w:r>
           </w:p>
         </w:tc>
@@ -853,18 +863,18 @@
           <w:tcPr>
             <w:tcW w:type="dxa" w:w="2340"/>
             <w:tcMar>
-              <w:top w:w="60" w:type="dxa"/>
-              <w:bottom w:w="60" w:type="dxa"/>
-              <w:left w:w="100" w:type="dxa"/>
-              <w:right w:w="100" w:type="dxa"/>
+              <w:top w:w="50" w:type="dxa"/>
+              <w:bottom w:w="50" w:type="dxa"/>
+              <w:left w:w="80" w:type="dxa"/>
+              <w:right w:w="80" w:type="dxa"/>
             </w:tcMar>
           </w:tcPr>
           <w:p>
             <w:r>
               <w:rPr>
-                <w:sz w:val="18"/>
+                <w:sz w:val="17"/>
               </w:rPr>
-              <w:t>Disk + object capacity</w:t>
+              <w:t>ResourceId (URI)</w:t>
             </w:r>
           </w:p>
         </w:tc>
@@ -872,18 +882,18 @@
           <w:tcPr>
             <w:tcW w:type="dxa" w:w="2340"/>
             <w:tcMar>
-              <w:top w:w="60" w:type="dxa"/>
-              <w:bottom w:w="60" w:type="dxa"/>
-              <w:left w:w="100" w:type="dxa"/>
-              <w:right w:w="100" w:type="dxa"/>
+              <w:top w:w="50" w:type="dxa"/>
+              <w:bottom w:w="50" w:type="dxa"/>
+              <w:left w:w="80" w:type="dxa"/>
+              <w:right w:w="80" w:type="dxa"/>
             </w:tcMar>
           </w:tcPr>
           <w:p>
             <w:r>
               <w:rPr>
-                <w:sz w:val="18"/>
+                <w:sz w:val="17"/>
               </w:rPr>
-              <w:t>Volume footprint for storage tiering</w:t>
+              <w:t>resource.global_name</w:t>
             </w:r>
           </w:p>
         </w:tc>
@@ -893,18 +903,18 @@
           <w:tcPr>
             <w:tcW w:type="dxa" w:w="2340"/>
             <w:tcMar>
-              <w:top w:w="60" w:type="dxa"/>
-              <w:bottom w:w="60" w:type="dxa"/>
-              <w:left w:w="100" w:type="dxa"/>
-              <w:right w:w="100" w:type="dxa"/>
+              <w:top w:w="50" w:type="dxa"/>
+              <w:bottom w:w="50" w:type="dxa"/>
+              <w:left w:w="80" w:type="dxa"/>
+              <w:right w:w="80" w:type="dxa"/>
             </w:tcMar>
           </w:tcPr>
           <w:p>
             <w:r>
               <w:rPr>
-                <w:sz w:val="18"/>
+                <w:sz w:val="17"/>
               </w:rPr>
-              <w:t>Data_Egress_GB</w:t>
+              <w:t>SkuId</w:t>
             </w:r>
           </w:p>
         </w:tc>
@@ -912,18 +922,18 @@
           <w:tcPr>
             <w:tcW w:type="dxa" w:w="2340"/>
             <w:tcMar>
-              <w:top w:w="60" w:type="dxa"/>
-              <w:bottom w:w="60" w:type="dxa"/>
-              <w:left w:w="100" w:type="dxa"/>
-              <w:right w:w="100" w:type="dxa"/>
+              <w:top w:w="50" w:type="dxa"/>
+              <w:bottom w:w="50" w:type="dxa"/>
+              <w:left w:w="80" w:type="dxa"/>
+              <w:right w:w="80" w:type="dxa"/>
             </w:tcMar>
           </w:tcPr>
           <w:p>
             <w:r>
               <w:rPr>
-                <w:sz w:val="18"/>
+                <w:sz w:val="17"/>
               </w:rPr>
-              <w:t>float</w:t>
+              <w:t>product/sku</w:t>
             </w:r>
           </w:p>
         </w:tc>
@@ -931,18 +941,18 @@
           <w:tcPr>
             <w:tcW w:type="dxa" w:w="2340"/>
             <w:tcMar>
-              <w:top w:w="60" w:type="dxa"/>
-              <w:bottom w:w="60" w:type="dxa"/>
-              <w:left w:w="100" w:type="dxa"/>
-              <w:right w:w="100" w:type="dxa"/>
+              <w:top w:w="50" w:type="dxa"/>
+              <w:bottom w:w="50" w:type="dxa"/>
+              <w:left w:w="80" w:type="dxa"/>
+              <w:right w:w="80" w:type="dxa"/>
             </w:tcMar>
           </w:tcPr>
           <w:p>
             <w:r>
               <w:rPr>
-                <w:sz w:val="18"/>
+                <w:sz w:val="17"/>
               </w:rPr>
-              <w:t>Internet outbound bandwidth</w:t>
+              <w:t>MeterId</w:t>
             </w:r>
           </w:p>
         </w:tc>
@@ -950,18 +960,18 @@
           <w:tcPr>
             <w:tcW w:type="dxa" w:w="2340"/>
             <w:tcMar>
-              <w:top w:w="60" w:type="dxa"/>
-              <w:bottom w:w="60" w:type="dxa"/>
-              <w:left w:w="100" w:type="dxa"/>
-              <w:right w:w="100" w:type="dxa"/>
+              <w:top w:w="50" w:type="dxa"/>
+              <w:bottom w:w="50" w:type="dxa"/>
+              <w:left w:w="80" w:type="dxa"/>
+              <w:right w:w="80" w:type="dxa"/>
             </w:tcMar>
           </w:tcPr>
           <w:p>
             <w:r>
               <w:rPr>
-                <w:sz w:val="18"/>
+                <w:sz w:val="17"/>
               </w:rPr>
-              <w:t>Bandwidth metric for egress surge detection</w:t>
+              <w:t>sku.id</w:t>
             </w:r>
           </w:p>
         </w:tc>
@@ -971,18 +981,18 @@
           <w:tcPr>
             <w:tcW w:type="dxa" w:w="2340"/>
             <w:tcMar>
-              <w:top w:w="60" w:type="dxa"/>
-              <w:bottom w:w="60" w:type="dxa"/>
-              <w:left w:w="100" w:type="dxa"/>
-              <w:right w:w="100" w:type="dxa"/>
+              <w:top w:w="50" w:type="dxa"/>
+              <w:bottom w:w="50" w:type="dxa"/>
+              <w:left w:w="80" w:type="dxa"/>
+              <w:right w:w="80" w:type="dxa"/>
             </w:tcMar>
           </w:tcPr>
           <w:p>
             <w:r>
               <w:rPr>
-                <w:sz w:val="18"/>
+                <w:sz w:val="17"/>
               </w:rPr>
-              <w:t>Is_Anomaly</w:t>
+              <w:t>SkuDescription</w:t>
             </w:r>
           </w:p>
         </w:tc>
@@ -990,18 +1000,18 @@
           <w:tcPr>
             <w:tcW w:type="dxa" w:w="2340"/>
             <w:tcMar>
-              <w:top w:w="60" w:type="dxa"/>
-              <w:bottom w:w="60" w:type="dxa"/>
-              <w:left w:w="100" w:type="dxa"/>
-              <w:right w:w="100" w:type="dxa"/>
+              <w:top w:w="50" w:type="dxa"/>
+              <w:bottom w:w="50" w:type="dxa"/>
+              <w:left w:w="80" w:type="dxa"/>
+              <w:right w:w="80" w:type="dxa"/>
             </w:tcMar>
           </w:tcPr>
           <w:p>
             <w:r>
               <w:rPr>
-                <w:sz w:val="18"/>
+                <w:sz w:val="17"/>
               </w:rPr>
-              <w:t>binary (0/1)</w:t>
+              <w:t>lineItem/LineItemDescription</w:t>
             </w:r>
           </w:p>
         </w:tc>
@@ -1009,18 +1019,18 @@
           <w:tcPr>
             <w:tcW w:type="dxa" w:w="2340"/>
             <w:tcMar>
-              <w:top w:w="60" w:type="dxa"/>
-              <w:bottom w:w="60" w:type="dxa"/>
-              <w:left w:w="100" w:type="dxa"/>
-              <w:right w:w="100" w:type="dxa"/>
+              <w:top w:w="50" w:type="dxa"/>
+              <w:bottom w:w="50" w:type="dxa"/>
+              <w:left w:w="80" w:type="dxa"/>
+              <w:right w:w="80" w:type="dxa"/>
             </w:tcMar>
           </w:tcPr>
           <w:p>
             <w:r>
               <w:rPr>
-                <w:sz w:val="18"/>
+                <w:sz w:val="17"/>
               </w:rPr>
-              <w:t>Ground truth indicator</w:t>
+              <w:t>MeterName</w:t>
             </w:r>
           </w:p>
         </w:tc>
@@ -1028,18 +1038,18 @@
           <w:tcPr>
             <w:tcW w:type="dxa" w:w="2340"/>
             <w:tcMar>
-              <w:top w:w="60" w:type="dxa"/>
-              <w:bottom w:w="60" w:type="dxa"/>
-              <w:left w:w="100" w:type="dxa"/>
-              <w:right w:w="100" w:type="dxa"/>
+              <w:top w:w="50" w:type="dxa"/>
+              <w:bottom w:w="50" w:type="dxa"/>
+              <w:left w:w="80" w:type="dxa"/>
+              <w:right w:w="80" w:type="dxa"/>
             </w:tcMar>
           </w:tcPr>
           <w:p>
             <w:r>
               <w:rPr>
-                <w:sz w:val="18"/>
+                <w:sz w:val="17"/>
               </w:rPr>
-              <w:t>Validation benchmark for detection recall</w:t>
+              <w:t>sku.description</w:t>
             </w:r>
           </w:p>
         </w:tc>
@@ -1049,18 +1059,18 @@
           <w:tcPr>
             <w:tcW w:type="dxa" w:w="2340"/>
             <w:tcMar>
-              <w:top w:w="60" w:type="dxa"/>
-              <w:bottom w:w="60" w:type="dxa"/>
-              <w:left w:w="100" w:type="dxa"/>
-              <w:right w:w="100" w:type="dxa"/>
+              <w:top w:w="50" w:type="dxa"/>
+              <w:bottom w:w="50" w:type="dxa"/>
+              <w:left w:w="80" w:type="dxa"/>
+              <w:right w:w="80" w:type="dxa"/>
             </w:tcMar>
           </w:tcPr>
           <w:p>
             <w:r>
               <w:rPr>
-                <w:sz w:val="18"/>
+                <w:sz w:val="17"/>
               </w:rPr>
-              <w:t>Anomaly_Type</w:t>
+              <w:t>ConsumedQuantity</w:t>
             </w:r>
           </w:p>
         </w:tc>
@@ -1068,18 +1078,18 @@
           <w:tcPr>
             <w:tcW w:type="dxa" w:w="2340"/>
             <w:tcMar>
-              <w:top w:w="60" w:type="dxa"/>
-              <w:bottom w:w="60" w:type="dxa"/>
-              <w:left w:w="100" w:type="dxa"/>
-              <w:right w:w="100" w:type="dxa"/>
+              <w:top w:w="50" w:type="dxa"/>
+              <w:bottom w:w="50" w:type="dxa"/>
+              <w:left w:w="80" w:type="dxa"/>
+              <w:right w:w="80" w:type="dxa"/>
             </w:tcMar>
           </w:tcPr>
           <w:p>
             <w:r>
               <w:rPr>
-                <w:sz w:val="18"/>
+                <w:sz w:val="17"/>
               </w:rPr>
-              <w:t>string</w:t>
+              <w:t>lineItem/UsageAmount</w:t>
             </w:r>
           </w:p>
         </w:tc>
@@ -1087,18 +1097,18 @@
           <w:tcPr>
             <w:tcW w:type="dxa" w:w="2340"/>
             <w:tcMar>
-              <w:top w:w="60" w:type="dxa"/>
-              <w:bottom w:w="60" w:type="dxa"/>
-              <w:left w:w="100" w:type="dxa"/>
-              <w:right w:w="100" w:type="dxa"/>
+              <w:top w:w="50" w:type="dxa"/>
+              <w:bottom w:w="50" w:type="dxa"/>
+              <w:left w:w="80" w:type="dxa"/>
+              <w:right w:w="80" w:type="dxa"/>
             </w:tcMar>
           </w:tcPr>
           <w:p>
             <w:r>
               <w:rPr>
-                <w:sz w:val="18"/>
+                <w:sz w:val="17"/>
               </w:rPr>
-              <w:t>Zombie, Egress, Storage</w:t>
+              <w:t>Quantity</w:t>
             </w:r>
           </w:p>
         </w:tc>
@@ -1106,18 +1116,18 @@
           <w:tcPr>
             <w:tcW w:type="dxa" w:w="2340"/>
             <w:tcMar>
-              <w:top w:w="60" w:type="dxa"/>
-              <w:bottom w:w="60" w:type="dxa"/>
-              <w:left w:w="100" w:type="dxa"/>
-              <w:right w:w="100" w:type="dxa"/>
+              <w:top w:w="50" w:type="dxa"/>
+              <w:bottom w:w="50" w:type="dxa"/>
+              <w:left w:w="80" w:type="dxa"/>
+              <w:right w:w="80" w:type="dxa"/>
             </w:tcMar>
           </w:tcPr>
           <w:p>
             <w:r>
               <w:rPr>
-                <w:sz w:val="18"/>
+                <w:sz w:val="17"/>
               </w:rPr>
-              <w:t>Operational diagnostic category</w:t>
+              <w:t>usage.amount</w:t>
             </w:r>
           </w:p>
         </w:tc>
@@ -1127,18 +1137,18 @@
           <w:tcPr>
             <w:tcW w:type="dxa" w:w="2340"/>
             <w:tcMar>
-              <w:top w:w="60" w:type="dxa"/>
-              <w:bottom w:w="60" w:type="dxa"/>
-              <w:left w:w="100" w:type="dxa"/>
-              <w:right w:w="100" w:type="dxa"/>
+              <w:top w:w="50" w:type="dxa"/>
+              <w:bottom w:w="50" w:type="dxa"/>
+              <w:left w:w="80" w:type="dxa"/>
+              <w:right w:w="80" w:type="dxa"/>
             </w:tcMar>
           </w:tcPr>
           <w:p>
             <w:r>
               <w:rPr>
-                <w:sz w:val="18"/>
+                <w:sz w:val="17"/>
               </w:rPr>
-              <w:t>Est_Waste_Cost_USD</w:t>
+              <w:t>BilledCost</w:t>
             </w:r>
           </w:p>
         </w:tc>
@@ -1146,18 +1156,18 @@
           <w:tcPr>
             <w:tcW w:type="dxa" w:w="2340"/>
             <w:tcMar>
-              <w:top w:w="60" w:type="dxa"/>
-              <w:bottom w:w="60" w:type="dxa"/>
-              <w:left w:w="100" w:type="dxa"/>
-              <w:right w:w="100" w:type="dxa"/>
+              <w:top w:w="50" w:type="dxa"/>
+              <w:bottom w:w="50" w:type="dxa"/>
+              <w:left w:w="80" w:type="dxa"/>
+              <w:right w:w="80" w:type="dxa"/>
             </w:tcMar>
           </w:tcPr>
           <w:p>
             <w:r>
               <w:rPr>
-                <w:sz w:val="18"/>
+                <w:sz w:val="17"/>
               </w:rPr>
-              <w:t>float</w:t>
+              <w:t>lineItem/UnblendedCost</w:t>
             </w:r>
           </w:p>
         </w:tc>
@@ -1165,18 +1175,18 @@
           <w:tcPr>
             <w:tcW w:type="dxa" w:w="2340"/>
             <w:tcMar>
-              <w:top w:w="60" w:type="dxa"/>
-              <w:bottom w:w="60" w:type="dxa"/>
-              <w:left w:w="100" w:type="dxa"/>
-              <w:right w:w="100" w:type="dxa"/>
+              <w:top w:w="50" w:type="dxa"/>
+              <w:bottom w:w="50" w:type="dxa"/>
+              <w:left w:w="80" w:type="dxa"/>
+              <w:right w:w="80" w:type="dxa"/>
             </w:tcMar>
           </w:tcPr>
           <w:p>
             <w:r>
               <w:rPr>
-                <w:sz w:val="18"/>
+                <w:sz w:val="17"/>
               </w:rPr>
-              <w:t>Cost minus efficient baseline</w:t>
+              <w:t>CostInBillingCurrency</w:t>
             </w:r>
           </w:p>
         </w:tc>
@@ -1184,18 +1194,18 @@
           <w:tcPr>
             <w:tcW w:type="dxa" w:w="2340"/>
             <w:tcMar>
-              <w:top w:w="60" w:type="dxa"/>
-              <w:bottom w:w="60" w:type="dxa"/>
-              <w:left w:w="100" w:type="dxa"/>
-              <w:right w:w="100" w:type="dxa"/>
+              <w:top w:w="50" w:type="dxa"/>
+              <w:bottom w:w="50" w:type="dxa"/>
+              <w:left w:w="80" w:type="dxa"/>
+              <w:right w:w="80" w:type="dxa"/>
             </w:tcMar>
           </w:tcPr>
           <w:p>
             <w:r>
               <w:rPr>
-                <w:sz w:val="18"/>
+                <w:sz w:val="17"/>
               </w:rPr>
-              <w:t>Quantified dollar waste amount</w:t>
+              <w:t>cost</w:t>
             </w:r>
           </w:p>
         </w:tc>
@@ -1205,18 +1215,18 @@
           <w:tcPr>
             <w:tcW w:type="dxa" w:w="2340"/>
             <w:tcMar>
-              <w:top w:w="60" w:type="dxa"/>
-              <w:bottom w:w="60" w:type="dxa"/>
-              <w:left w:w="100" w:type="dxa"/>
-              <w:right w:w="100" w:type="dxa"/>
+              <w:top w:w="50" w:type="dxa"/>
+              <w:bottom w:w="50" w:type="dxa"/>
+              <w:left w:w="80" w:type="dxa"/>
+              <w:right w:w="80" w:type="dxa"/>
             </w:tcMar>
           </w:tcPr>
           <w:p>
             <w:r>
               <w:rPr>
-                <w:sz w:val="18"/>
+                <w:sz w:val="17"/>
               </w:rPr>
-              <w:t>Potential_Savings_USD</w:t>
+              <w:t>EffectiveCost</w:t>
             </w:r>
           </w:p>
         </w:tc>
@@ -1224,18 +1234,18 @@
           <w:tcPr>
             <w:tcW w:type="dxa" w:w="2340"/>
             <w:tcMar>
-              <w:top w:w="60" w:type="dxa"/>
-              <w:bottom w:w="60" w:type="dxa"/>
-              <w:left w:w="100" w:type="dxa"/>
-              <w:right w:w="100" w:type="dxa"/>
+              <w:top w:w="50" w:type="dxa"/>
+              <w:bottom w:w="50" w:type="dxa"/>
+              <w:left w:w="80" w:type="dxa"/>
+              <w:right w:w="80" w:type="dxa"/>
             </w:tcMar>
           </w:tcPr>
           <w:p>
             <w:r>
               <w:rPr>
-                <w:sz w:val="18"/>
+                <w:sz w:val="17"/>
               </w:rPr>
-              <w:t>float</w:t>
+              <w:t>lineItem/NetUnblendedCost</w:t>
             </w:r>
           </w:p>
         </w:tc>
@@ -1243,18 +1253,18 @@
           <w:tcPr>
             <w:tcW w:type="dxa" w:w="2340"/>
             <w:tcMar>
-              <w:top w:w="60" w:type="dxa"/>
-              <w:bottom w:w="60" w:type="dxa"/>
-              <w:left w:w="100" w:type="dxa"/>
-              <w:right w:w="100" w:type="dxa"/>
+              <w:top w:w="50" w:type="dxa"/>
+              <w:bottom w:w="50" w:type="dxa"/>
+              <w:left w:w="80" w:type="dxa"/>
+              <w:right w:w="80" w:type="dxa"/>
             </w:tcMar>
           </w:tcPr>
           <w:p>
             <w:r>
               <w:rPr>
-                <w:sz w:val="18"/>
+                <w:sz w:val="17"/>
               </w:rPr>
-              <w:t>Rightsizing opportunity</w:t>
+              <w:t>EffectivePrice * Quantity</w:t>
             </w:r>
           </w:p>
         </w:tc>
@@ -1262,18 +1272,18 @@
           <w:tcPr>
             <w:tcW w:type="dxa" w:w="2340"/>
             <w:tcMar>
-              <w:top w:w="60" w:type="dxa"/>
-              <w:bottom w:w="60" w:type="dxa"/>
-              <w:left w:w="100" w:type="dxa"/>
-              <w:right w:w="100" w:type="dxa"/>
+              <w:top w:w="50" w:type="dxa"/>
+              <w:bottom w:w="50" w:type="dxa"/>
+              <w:left w:w="80" w:type="dxa"/>
+              <w:right w:w="80" w:type="dxa"/>
             </w:tcMar>
           </w:tcPr>
           <w:p>
             <w:r>
               <w:rPr>
-                <w:sz w:val="18"/>
+                <w:sz w:val="17"/>
               </w:rPr>
-              <w:t>Immediate actionable savings potential</w:t>
+              <w:t>cost - credits</w:t>
             </w:r>
           </w:p>
         </w:tc>
@@ -1283,18 +1293,18 @@
           <w:tcPr>
             <w:tcW w:type="dxa" w:w="2340"/>
             <w:tcMar>
-              <w:top w:w="60" w:type="dxa"/>
-              <w:bottom w:w="60" w:type="dxa"/>
-              <w:left w:w="100" w:type="dxa"/>
-              <w:right w:w="100" w:type="dxa"/>
+              <w:top w:w="50" w:type="dxa"/>
+              <w:bottom w:w="50" w:type="dxa"/>
+              <w:left w:w="80" w:type="dxa"/>
+              <w:right w:w="80" w:type="dxa"/>
             </w:tcMar>
           </w:tcPr>
           <w:p>
             <w:r>
               <w:rPr>
-                <w:sz w:val="18"/>
+                <w:sz w:val="17"/>
               </w:rPr>
-              <w:t>FinOps_Recommendation</w:t>
+              <w:t>ListCost</w:t>
             </w:r>
           </w:p>
         </w:tc>
@@ -1302,18 +1312,18 @@
           <w:tcPr>
             <w:tcW w:type="dxa" w:w="2340"/>
             <w:tcMar>
-              <w:top w:w="60" w:type="dxa"/>
-              <w:bottom w:w="60" w:type="dxa"/>
-              <w:left w:w="100" w:type="dxa"/>
-              <w:right w:w="100" w:type="dxa"/>
+              <w:top w:w="50" w:type="dxa"/>
+              <w:bottom w:w="50" w:type="dxa"/>
+              <w:left w:w="80" w:type="dxa"/>
+              <w:right w:w="80" w:type="dxa"/>
             </w:tcMar>
           </w:tcPr>
           <w:p>
             <w:r>
               <w:rPr>
-                <w:sz w:val="18"/>
+                <w:sz w:val="17"/>
               </w:rPr>
-              <w:t>string</w:t>
+              <w:t>pricing/publicOnDemandCost</w:t>
             </w:r>
           </w:p>
         </w:tc>
@@ -1321,18 +1331,18 @@
           <w:tcPr>
             <w:tcW w:type="dxa" w:w="2340"/>
             <w:tcMar>
-              <w:top w:w="60" w:type="dxa"/>
-              <w:bottom w:w="60" w:type="dxa"/>
-              <w:left w:w="100" w:type="dxa"/>
-              <w:right w:w="100" w:type="dxa"/>
+              <w:top w:w="50" w:type="dxa"/>
+              <w:bottom w:w="50" w:type="dxa"/>
+              <w:left w:w="80" w:type="dxa"/>
+              <w:right w:w="80" w:type="dxa"/>
             </w:tcMar>
           </w:tcPr>
           <w:p>
             <w:r>
               <w:rPr>
-                <w:sz w:val="18"/>
+                <w:sz w:val="17"/>
               </w:rPr>
-              <w:t>Prescriptive rule engine</w:t>
+              <w:t>UnitPrice * Quantity</w:t>
             </w:r>
           </w:p>
         </w:tc>
@@ -1340,23 +1350,262 @@
           <w:tcPr>
             <w:tcW w:type="dxa" w:w="2340"/>
             <w:tcMar>
-              <w:top w:w="60" w:type="dxa"/>
-              <w:bottom w:w="60" w:type="dxa"/>
-              <w:left w:w="100" w:type="dxa"/>
-              <w:right w:w="100" w:type="dxa"/>
+              <w:top w:w="50" w:type="dxa"/>
+              <w:bottom w:w="50" w:type="dxa"/>
+              <w:left w:w="80" w:type="dxa"/>
+              <w:right w:w="80" w:type="dxa"/>
             </w:tcMar>
           </w:tcPr>
           <w:p>
             <w:r>
               <w:rPr>
-                <w:sz w:val="18"/>
+                <w:sz w:val="17"/>
               </w:rPr>
-              <w:t>Engineering action instruction</w:t>
+              <w:t>list_cost</w:t>
+            </w:r>
+          </w:p>
+        </w:tc>
+      </w:tr>
+      <w:tr>
+        <w:tc>
+          <w:tcPr>
+            <w:tcW w:type="dxa" w:w="2340"/>
+            <w:tcMar>
+              <w:top w:w="50" w:type="dxa"/>
+              <w:bottom w:w="50" w:type="dxa"/>
+              <w:left w:w="80" w:type="dxa"/>
+              <w:right w:w="80" w:type="dxa"/>
+            </w:tcMar>
+          </w:tcPr>
+          <w:p>
+            <w:r>
+              <w:rPr>
+                <w:sz w:val="17"/>
+              </w:rPr>
+              <w:t>PricingCategory</w:t>
+            </w:r>
+          </w:p>
+        </w:tc>
+        <w:tc>
+          <w:tcPr>
+            <w:tcW w:type="dxa" w:w="2340"/>
+            <w:tcMar>
+              <w:top w:w="50" w:type="dxa"/>
+              <w:bottom w:w="50" w:type="dxa"/>
+              <w:left w:w="80" w:type="dxa"/>
+              <w:right w:w="80" w:type="dxa"/>
+            </w:tcMar>
+          </w:tcPr>
+          <w:p>
+            <w:r>
+              <w:rPr>
+                <w:sz w:val="17"/>
+              </w:rPr>
+              <w:t>pricing/term ('OnDemand')</w:t>
+            </w:r>
+          </w:p>
+        </w:tc>
+        <w:tc>
+          <w:tcPr>
+            <w:tcW w:type="dxa" w:w="2340"/>
+            <w:tcMar>
+              <w:top w:w="50" w:type="dxa"/>
+              <w:bottom w:w="50" w:type="dxa"/>
+              <w:left w:w="80" w:type="dxa"/>
+              <w:right w:w="80" w:type="dxa"/>
+            </w:tcMar>
+          </w:tcPr>
+          <w:p>
+            <w:r>
+              <w:rPr>
+                <w:sz w:val="17"/>
+              </w:rPr>
+              <w:t>PricingModel ('OnDemand')</w:t>
+            </w:r>
+          </w:p>
+        </w:tc>
+        <w:tc>
+          <w:tcPr>
+            <w:tcW w:type="dxa" w:w="2340"/>
+            <w:tcMar>
+              <w:top w:w="50" w:type="dxa"/>
+              <w:bottom w:w="50" w:type="dxa"/>
+              <w:left w:w="80" w:type="dxa"/>
+              <w:right w:w="80" w:type="dxa"/>
+            </w:tcMar>
+          </w:tcPr>
+          <w:p>
+            <w:r>
+              <w:rPr>
+                <w:sz w:val="17"/>
+              </w:rPr>
+              <w:t>cost_type ('regular')</w:t>
+            </w:r>
+          </w:p>
+        </w:tc>
+      </w:tr>
+      <w:tr>
+        <w:tc>
+          <w:tcPr>
+            <w:tcW w:type="dxa" w:w="2340"/>
+            <w:tcMar>
+              <w:top w:w="50" w:type="dxa"/>
+              <w:bottom w:w="50" w:type="dxa"/>
+              <w:left w:w="80" w:type="dxa"/>
+              <w:right w:w="80" w:type="dxa"/>
+            </w:tcMar>
+          </w:tcPr>
+          <w:p>
+            <w:r>
+              <w:rPr>
+                <w:sz w:val="17"/>
+              </w:rPr>
+              <w:t>TagCostCenter</w:t>
+            </w:r>
+          </w:p>
+        </w:tc>
+        <w:tc>
+          <w:tcPr>
+            <w:tcW w:type="dxa" w:w="2340"/>
+            <w:tcMar>
+              <w:top w:w="50" w:type="dxa"/>
+              <w:bottom w:w="50" w:type="dxa"/>
+              <w:left w:w="80" w:type="dxa"/>
+              <w:right w:w="80" w:type="dxa"/>
+            </w:tcMar>
+          </w:tcPr>
+          <w:p>
+            <w:r>
+              <w:rPr>
+                <w:sz w:val="17"/>
+              </w:rPr>
+              <w:t>resourceTags/user:CostCenter</w:t>
+            </w:r>
+          </w:p>
+        </w:tc>
+        <w:tc>
+          <w:tcPr>
+            <w:tcW w:type="dxa" w:w="2340"/>
+            <w:tcMar>
+              <w:top w:w="50" w:type="dxa"/>
+              <w:bottom w:w="50" w:type="dxa"/>
+              <w:left w:w="80" w:type="dxa"/>
+              <w:right w:w="80" w:type="dxa"/>
+            </w:tcMar>
+          </w:tcPr>
+          <w:p>
+            <w:r>
+              <w:rPr>
+                <w:sz w:val="17"/>
+              </w:rPr>
+              <w:t>tags/CostCenter</w:t>
+            </w:r>
+          </w:p>
+        </w:tc>
+        <w:tc>
+          <w:tcPr>
+            <w:tcW w:type="dxa" w:w="2340"/>
+            <w:tcMar>
+              <w:top w:w="50" w:type="dxa"/>
+              <w:bottom w:w="50" w:type="dxa"/>
+              <w:left w:w="80" w:type="dxa"/>
+              <w:right w:w="80" w:type="dxa"/>
+            </w:tcMar>
+          </w:tcPr>
+          <w:p>
+            <w:r>
+              <w:rPr>
+                <w:sz w:val="17"/>
+              </w:rPr>
+              <w:t>project.labels.cost_center</w:t>
+            </w:r>
+          </w:p>
+        </w:tc>
+      </w:tr>
+      <w:tr>
+        <w:tc>
+          <w:tcPr>
+            <w:tcW w:type="dxa" w:w="2340"/>
+            <w:tcMar>
+              <w:top w:w="50" w:type="dxa"/>
+              <w:bottom w:w="50" w:type="dxa"/>
+              <w:left w:w="80" w:type="dxa"/>
+              <w:right w:w="80" w:type="dxa"/>
+            </w:tcMar>
+          </w:tcPr>
+          <w:p>
+            <w:r>
+              <w:rPr>
+                <w:sz w:val="17"/>
+              </w:rPr>
+              <w:t>AvgCpuUtilizationPct</w:t>
+            </w:r>
+          </w:p>
+        </w:tc>
+        <w:tc>
+          <w:tcPr>
+            <w:tcW w:type="dxa" w:w="2340"/>
+            <w:tcMar>
+              <w:top w:w="50" w:type="dxa"/>
+              <w:bottom w:w="50" w:type="dxa"/>
+              <w:left w:w="80" w:type="dxa"/>
+              <w:right w:w="80" w:type="dxa"/>
+            </w:tcMar>
+          </w:tcPr>
+          <w:p>
+            <w:r>
+              <w:rPr>
+                <w:sz w:val="17"/>
+              </w:rPr>
+              <w:t>AWS CloudWatch (CPUUtilization)</w:t>
+            </w:r>
+          </w:p>
+        </w:tc>
+        <w:tc>
+          <w:tcPr>
+            <w:tcW w:type="dxa" w:w="2340"/>
+            <w:tcMar>
+              <w:top w:w="50" w:type="dxa"/>
+              <w:bottom w:w="50" w:type="dxa"/>
+              <w:left w:w="80" w:type="dxa"/>
+              <w:right w:w="80" w:type="dxa"/>
+            </w:tcMar>
+          </w:tcPr>
+          <w:p>
+            <w:r>
+              <w:rPr>
+                <w:sz w:val="17"/>
+              </w:rPr>
+              <w:t>Azure Monitor (Percentage CPU)</w:t>
+            </w:r>
+          </w:p>
+        </w:tc>
+        <w:tc>
+          <w:tcPr>
+            <w:tcW w:type="dxa" w:w="2340"/>
+            <w:tcMar>
+              <w:top w:w="50" w:type="dxa"/>
+              <w:bottom w:w="50" w:type="dxa"/>
+              <w:left w:w="80" w:type="dxa"/>
+              <w:right w:w="80" w:type="dxa"/>
+            </w:tcMar>
+          </w:tcPr>
+          <w:p>
+            <w:r>
+              <w:rPr>
+                <w:sz w:val="17"/>
+              </w:rPr>
+              <w:t>Cloud Operations (instance/cpu)</w:t>
             </w:r>
           </w:p>
         </w:tc>
       </w:tr>
     </w:tbl>
+    <w:p>
+      <w:r>
+        <w:br/>
+      </w:r>
+    </w:p>
     <w:p>
       <w:r>
         <w:br w:type="page"/>
@@ -1567,7 +1816,7 @@
         <w:br/>
       </w:r>
       <w:r>
-        <w:t xml:space="preserve">    MAPE = (100% / n) * Σ | (y_t - ŷ_t) / y_t | = 4.87%</w:t>
+        <w:t xml:space="preserve">    MAPE = (100% / n) * Σ | (y_t - ŷ_t) / y_t | = 2.48% (50.2% error reduction)</w:t>
         <w:br/>
         <w:br/>
       </w:r>
@@ -1579,7 +1828,7 @@
         <w:br/>
       </w:r>
       <w:r>
-        <w:t xml:space="preserve">    RMSE = sqrt( (1 / n) * Σ (y_t - ŷ_t)^2 ) = $1,573.43</w:t>
+        <w:t xml:space="preserve">    RMSE = sqrt( (1 / n) * Σ (y_t - ŷ_t)^2 ) = $671.79 (46.2% error reduction)</w:t>
         <w:br/>
         <w:br/>
       </w:r>
@@ -1591,7 +1840,7 @@
         <w:br/>
       </w:r>
       <w:r>
-        <w:t xml:space="preserve">    MAE = (1 / n) * Σ | y_t - ŷ_t | = $1,199.36</w:t>
+        <w:t xml:space="preserve">    MAE = (1 / n) * Σ | y_t - ŷ_t | = $442.88 (49.7% error reduction)</w:t>
       </w:r>
     </w:p>
     <w:p>
@@ -1780,7 +2029,7 @@
               <w:rPr>
                 <w:sz w:val="18"/>
               </w:rPr>
-              <w:t>$143,705.60 / yr</w:t>
+              <w:t>$102,242.53 / yr</w:t>
             </w:r>
           </w:p>
         </w:tc>
@@ -1858,7 +2107,7 @@
               <w:rPr>
                 <w:sz w:val="18"/>
               </w:rPr>
-              <w:t>$752,878.56 / yr</w:t>
+              <w:t>$627,887.79 / yr</w:t>
             </w:r>
           </w:p>
         </w:tc>
@@ -1936,7 +2185,7 @@
               <w:rPr>
                 <w:sz w:val="18"/>
               </w:rPr>
-              <w:t>$1,552,833.07 / yr</w:t>
+              <w:t>$1,216,307.66 / yr</w:t>
             </w:r>
           </w:p>
         </w:tc>
@@ -2014,7 +2263,7 @@
               <w:rPr>
                 <w:sz w:val="18"/>
               </w:rPr>
-              <w:t>$293,298.27 / yr</w:t>
+              <w:t>$177,390.47 / yr</w:t>
             </w:r>
           </w:p>
         </w:tc>
@@ -2100,7 +2349,7 @@
                 <w:b/>
                 <w:sz w:val="18"/>
               </w:rPr>
-              <w:t>$2,742,715.50 (32.9%)</w:t>
+              <w:t>$2,123,828.44 (31.9%)</w:t>
             </w:r>
           </w:p>
         </w:tc>
@@ -2127,9 +2376,35 @@
         <w:br/>
         <w:t>• Score &lt; 55: Crawl Stage (Reactive / High Waste)</w:t>
         <w:br/>
-        <w:t>• Score 55–77: Walk Stage (Proactive Governance) — Abhi Cloud Tech currently scores 71 ('Walk')</w:t>
+        <w:t>• Score 55–77: Walk Stage (Proactive Governance) — Abhi Cloud Tech currently scores 77 ('Walk')</w:t>
         <w:br/>
         <w:t>• Score &gt;= 78: Run Stage (Continuous Unit Economics &amp; Automated Auto-Remediation)</w:t>
+      </w:r>
+    </w:p>
+    <w:p>
+      <w:pPr>
+        <w:pStyle w:val="Heading2"/>
+      </w:pPr>
+      <w:r>
+        <w:t>5.2 Multi-Cloud Machine Type &amp; Instance Family Unit Economics Engine</w:t>
+      </w:r>
+    </w:p>
+    <w:p>
+      <w:r>
+        <w:t>Conventional rightsizing logic erroneously treats compute capacity as a flat commodity based solely on vCPU count and memory gigabytes. In production cloud deployments, machine family architectures dictate dramatic unit-cost variances for identical core allocations:</w:t>
+        <w:br/>
+        <w:t>• Google Cloud Platform (GCP): E2 cost-optimized dynamic instances ($0.0336/vCPU, $0.0045/RAM) deliver a 28% direct unit-cost savings over standard N2 Cascade/Ice Lake ($0.0465/vCPU, $0.0057/RAM). For instance, an e2-standard-32 with 128GB RAM costs $1,188.86/mo in us-central1 compared to $1,596.67/mo on n2-standard-32 — yielding $407.81/month in recurring EBITDA recovery without downsizing core capacity.</w:t>
+        <w:br/>
+        <w:t>• Amazon Web Services (AWS): Custom ARM-based Graviton2/3 (m6g) instances ($0.0384/vCPU, $0.0048/RAM) provide a 20% direct price reduction over traditional Intel Xeon (m6i) instances ($0.0480/vCPU, $0.0060/RAM).</w:t>
+        <w:br/>
+        <w:t>• Microsoft Azure: Standard_B series burstable economy tier ($0.0356/vCPU, $0.0044/RAM) slashes non-production and dev/test computing spend by 25% compared to baseline Standard_Dsv5 general purpose ($0.0475/vCPU, $0.0059/RAM).</w:t>
+        <w:br/>
+        <w:br/>
+        <w:t>The unit economics simulation engine calculates hourly burn with regional tariff multipliers:</w:t>
+        <w:br/>
+        <w:t xml:space="preserve">    HourlyCost = ((vCPU * family.vcpu_rate) + (RAM * family.ram_rate)) * region.multiplier</w:t>
+        <w:br/>
+        <w:t>FinOps engineers can snapshot scenario configurations into a side-by-side comparison drawer and export prioritized action items to CSV.</w:t>
       </w:r>
     </w:p>
     <w:p>
@@ -2169,7 +2444,56 @@
         <w:pStyle w:val="Heading1"/>
       </w:pPr>
       <w:r>
-        <w:t>7. Master Presentation Defense &amp; Technical Viva Q&amp;A</w:t>
+        <w:t>7. Multi-Cloud Machine Image &amp; Snapshot Waste Remediation</w:t>
+      </w:r>
+    </w:p>
+    <w:p>
+      <w:r>
+        <w:t>In production enterprise multi-cloud environments, one of the most pervasive sources of unbudgeted expenditure is unattached disk snapshots and obsolete machine images. Because volume snapshots and custom machine images are decoupled from the VM instance lifecycle, terminating an instance leaves its associated EBS snapshots, Azure Managed Disk snapshots, and GCP Machine Images accumulating storage charges indefinitely.</w:t>
+        <w:br/>
+        <w:br/>
+        <w:t>Abhi Cloud Tech's FinOps Platform specifically tracks and optimizes these storage artifacts:</w:t>
+        <w:br/>
+        <w:t>• AWS: AmazonEC2-Snapshots (EBS Snapshots &amp; AMI images billed at $0.05/GB-month). Automated remediation via AWS Data Lifecycle Manager (DLM).</w:t>
+        <w:br/>
+        <w:t>• Azure: Microsoft.Compute/snapshots (Differential and full disk snapshots, Compute Gallery images billed at $0.05/GB-month). Remediated via Azure Backup Policies.</w:t>
+        <w:br/>
+        <w:t>• GCP: Compute Engine - Snapshots &amp; Images (Persistent Disk snapshots and custom boot machine images billed at $0.026 - $0.05/GB-month). Remediated via GCP Snapshot Schedules.</w:t>
+        <w:br/>
+        <w:br/>
+        <w:t>Our FinOps Recommendation Engine flags snapshots older than 30 days without volume association as P1 - Critical, yielding $567,209.59 in annual recoverable spend.</w:t>
+      </w:r>
+    </w:p>
+    <w:p>
+      <w:pPr>
+        <w:pStyle w:val="Heading1"/>
+      </w:pPr>
+      <w:r>
+        <w:t>8. Jupyter Notebook Architecture (.ipynb) for ML &amp; Data Operations</w:t>
+      </w:r>
+    </w:p>
+    <w:p>
+      <w:r>
+        <w:t>To provide block-by-block clarity into data handling, anomaly detection, forecasting, and optimization, the entire machine learning lifecycle is documented and executable in standard Jupyter Notebook (.ipynb) format:</w:t>
+        <w:br/>
+        <w:br/>
+        <w:t>1. notebooks/01_dataset_generation_and_warehouse.ipynb: FOCUS 1.0 schema specification, multi-cloud catalog definition (including GCP e2 vs n2 machine families), 32,850 synthetic telemetry records generation, anomaly injection, and SQLite warehouse ingestion.</w:t>
+        <w:br/>
+        <w:t>2. notebooks/02_ml_anomaly_detection.ipynb: Dual-engine anomaly detection using 28-day rolling baseline (Z-score 3.0) and Scikit-Learn Isolation Forest, with automated root-cause diagnostics for snapshot waste and zombie instances.</w:t>
+        <w:br/>
+        <w:t>3. notebooks/03_spend_forecasting.ipynb: Time-series lag feature engineering, cyclical Fourier harmonics, and HistGradientBoosting multi-quantile regression (5th, 50th, 95th percentiles) with strict non-crossing monotonicity guarantees.</w:t>
+        <w:br/>
+        <w:t>4. notebooks/04_finops_optimization_and_rightsizing.ipynb: Compute rightsizing, machine family pricing analysis, snapshot lifecycle audit, and ROI savings portfolio breakdown.</w:t>
+        <w:br/>
+        <w:t>5. FinOps_Intelligence_Master_Pipeline.ipynb (Project Root): Interactive master orchestration notebook uniting all four stages into an executive end-to-end workflow.</w:t>
+      </w:r>
+    </w:p>
+    <w:p>
+      <w:pPr>
+        <w:pStyle w:val="Heading1"/>
+      </w:pPr>
+      <w:r>
+        <w:t>9. Master Presentation Defense &amp; Technical Viva Q&amp;A</w:t>
       </w:r>
     </w:p>
     <w:p>
@@ -2246,7 +2570,7 @@
           <w:b/>
           <w:color w:val="0F172A"/>
         </w:rPr>
-        <w:t>Q4: How do you achieve a 4.87% MAPE score?</w:t>
+        <w:t>Q4: How do you achieve a 4.01% MAPE score?</w:t>
       </w:r>
     </w:p>
     <w:p>
@@ -2274,7 +2598,47 @@
         <w:spacing w:before="0" w:after="160"/>
       </w:pPr>
       <w:r>
-        <w:t>A5: Across an $8.37M annualized run-rate, the system identified $2.75M in annual waste (32.9% savings). The largest lever is transitioning predictable baseline workloads into 1-Year / 3-Year Commitment Plans ($1.55M savings), followed by downsizing underutilized compute instances ($752K savings) and auto-stopping idle off-hours clusters ($143K savings).</w:t>
+        <w:t>A5: Across a $4.10M annualized run-rate, the system identified $934,836 in annual recoverable spend (22.8% savings). The largest single lever is Stale Machine Image and Snapshot cleanup ($567,210 savings), followed by Compute Rightsizing ($334,142 savings) and Idle Instance termination ($33,485 savings).</w:t>
+      </w:r>
+    </w:p>
+    <w:p>
+      <w:pPr>
+        <w:spacing w:before="160" w:after="40"/>
+      </w:pPr>
+      <w:r>
+        <w:rPr>
+          <w:b/>
+          <w:color w:val="0F172A"/>
+        </w:rPr>
+        <w:t>Q6: Why are Machine Images and Snapshots considered silent enterprise waste, and how do you remediate them?</w:t>
+      </w:r>
+    </w:p>
+    <w:p>
+      <w:pPr>
+        <w:spacing w:before="0" w:after="160"/>
+      </w:pPr>
+      <w:r>
+        <w:t>A6: Cloud disk snapshots are stored independently from VM instances. When engineering teams terminate ephemeral test or build instances, automated backup policies or manual snapshots remain active indefinitely, silently billing $0.05/GB-month. Our optimizer identifies snapshots older than 30 days without volume attachment, flags them as P1 - Critical, and provides automated AWS DLM, Azure Backup, and GCP Snapshot Schedule policies to enforce automated lifecycle expiration.</w:t>
+      </w:r>
+    </w:p>
+    <w:p>
+      <w:pPr>
+        <w:spacing w:before="160" w:after="40"/>
+      </w:pPr>
+      <w:r>
+        <w:rPr>
+          <w:b/>
+          <w:color w:val="0F172A"/>
+        </w:rPr>
+        <w:t>Q7: Why are Jupyter Notebooks (.ipynb) integrated alongside the FastAPI web application?</w:t>
+      </w:r>
+    </w:p>
+    <w:p>
+      <w:pPr>
+        <w:spacing w:before="0" w:after="160"/>
+      </w:pPr>
+      <w:r>
+        <w:t>A7: In enterprise ML, notebook files (.ipynb) provide reproducible, transparent, block-by-block clarity for data scientists, cloud auditors, and FinOps practitioners. Each notebook isolates a specific phase (data ingestion, anomaly detection, forecasting, rightsizing) with markdown explanations, code blocks, and visual plots, making it immediately clear where code executes and how metrics are derived.</w:t>
       </w:r>
     </w:p>
     <w:p>

</xml_diff>